<commit_message>
User Guide 8.2 further revisions; From Mosaic to Figure 1.1
Glen's continued edits to the guide, the new From Mosaic to Figure
document, and the sample mosaic tile list.

Co-Authored-By: Claude Fable 5 <noreply@anthropic.com>
</commit_message>
<xml_diff>
--- a/Documents/User Guide (Ver 8.2).docx
+++ b/Documents/User Guide (Ver 8.2).docx
@@ -187,7 +187,14 @@
           <w:rFonts w:eastAsia="Times New Roman"/>
           <w:sz w:val="24"/>
         </w:rPr>
-        <w:t>Version 8.1</w:t>
+        <w:t>Version 8.</w:t>
+      </w:r>
+      <w:r>
+        <w:rPr>
+          <w:rFonts w:eastAsia="Times New Roman"/>
+          <w:sz w:val="24"/>
+        </w:rPr>
+        <w:t>2</w:t>
       </w:r>
     </w:p>
     <w:p>
@@ -8142,7 +8149,7 @@
                                     </pic:cNvPicPr>
                                   </pic:nvPicPr>
                                   <pic:blipFill>
-                                    <a:blip r:embed="rId28">
+                                    <a:blip r:embed="rId29">
                                       <a:extLst>
                                         <a:ext uri="{28A0092B-C50C-407E-A947-70E740481C1C}">
                                           <a14:useLocalDpi xmlns:a14="http://schemas.microsoft.com/office/drawing/2010/main" val="0"/>
@@ -8820,7 +8827,7 @@
                     <pic:cNvPicPr/>
                   </pic:nvPicPr>
                   <pic:blipFill>
-                    <a:blip r:embed="rId29"/>
+                    <a:blip r:embed="rId30"/>
                     <a:stretch>
                       <a:fillRect/>
                     </a:stretch>
@@ -8989,7 +8996,7 @@
                     <pic:cNvPicPr/>
                   </pic:nvPicPr>
                   <pic:blipFill>
-                    <a:blip r:embed="rId30"/>
+                    <a:blip r:embed="rId31"/>
                     <a:stretch>
                       <a:fillRect/>
                     </a:stretch>
@@ -9249,7 +9256,7 @@
                     <pic:cNvPicPr/>
                   </pic:nvPicPr>
                   <pic:blipFill>
-                    <a:blip r:embed="rId31"/>
+                    <a:blip r:embed="rId32"/>
                     <a:stretch>
                       <a:fillRect/>
                     </a:stretch>
@@ -9366,7 +9373,7 @@
                     <pic:cNvPicPr/>
                   </pic:nvPicPr>
                   <pic:blipFill>
-                    <a:blip r:embed="rId32"/>
+                    <a:blip r:embed="rId33"/>
                     <a:stretch>
                       <a:fillRect/>
                     </a:stretch>
@@ -9699,7 +9706,7 @@
                     <pic:cNvPicPr/>
                   </pic:nvPicPr>
                   <pic:blipFill>
-                    <a:blip r:embed="rId33"/>
+                    <a:blip r:embed="rId34"/>
                     <a:stretch>
                       <a:fillRect/>
                     </a:stretch>
@@ -9847,7 +9854,7 @@
                     <pic:cNvPicPr/>
                   </pic:nvPicPr>
                   <pic:blipFill>
-                    <a:blip r:embed="rId34"/>
+                    <a:blip r:embed="rId35"/>
                     <a:stretch>
                       <a:fillRect/>
                     </a:stretch>
@@ -9938,7 +9945,7 @@
                     <pic:cNvPicPr/>
                   </pic:nvPicPr>
                   <pic:blipFill>
-                    <a:blip r:embed="rId35"/>
+                    <a:blip r:embed="rId36"/>
                     <a:stretch>
                       <a:fillRect/>
                     </a:stretch>
@@ -10130,7 +10137,7 @@
                     <pic:cNvPicPr/>
                   </pic:nvPicPr>
                   <pic:blipFill>
-                    <a:blip r:embed="rId36"/>
+                    <a:blip r:embed="rId37"/>
                     <a:stretch>
                       <a:fillRect/>
                     </a:stretch>
@@ -10170,7 +10177,7 @@
                     <pic:cNvPicPr/>
                   </pic:nvPicPr>
                   <pic:blipFill>
-                    <a:blip r:embed="rId37"/>
+                    <a:blip r:embed="rId38"/>
                     <a:stretch>
                       <a:fillRect/>
                     </a:stretch>
@@ -10371,7 +10378,7 @@
                     <pic:cNvPicPr/>
                   </pic:nvPicPr>
                   <pic:blipFill>
-                    <a:blip r:embed="rId38"/>
+                    <a:blip r:embed="rId39"/>
                     <a:stretch>
                       <a:fillRect/>
                     </a:stretch>
@@ -10417,7 +10424,7 @@
                     <pic:cNvPicPr/>
                   </pic:nvPicPr>
                   <pic:blipFill>
-                    <a:blip r:embed="rId39"/>
+                    <a:blip r:embed="rId40"/>
                     <a:stretch>
                       <a:fillRect/>
                     </a:stretch>
@@ -13568,7 +13575,7 @@
         </w:rPr>
         <w:t xml:space="preserve">  Elaine Wolfe’s TurtleStitch site has many projects that can be cut out on a Silhouette Die cutter:  </w:t>
       </w:r>
-      <w:hyperlink r:id="rId40" w:history="1">
+      <w:hyperlink r:id="rId41" w:history="1">
         <w:r>
           <w:rPr>
             <w:rStyle w:val="Hyperlink"/>
@@ -13625,7 +13632,7 @@
                     <pic:cNvPicPr/>
                   </pic:nvPicPr>
                   <pic:blipFill>
-                    <a:blip r:embed="rId41"/>
+                    <a:blip r:embed="rId42"/>
                     <a:stretch>
                       <a:fillRect/>
                     </a:stretch>
@@ -13860,7 +13867,7 @@
       </w:r>
     </w:p>
     <w:sectPr>
-      <w:footerReference w:type="default" r:id="rId42"/>
+      <w:footerReference w:type="default" r:id="rId43"/>
       <w:pgSz w:w="12240" w:h="15840"/>
       <w:pgMar w:top="1440" w:right="1530" w:bottom="1440" w:left="1440" w:header="720" w:footer="720" w:gutter="0"/>
       <w:pgNumType w:start="1"/>

</xml_diff>